<commit_message>
Shakti docx updated with right text value 8.9% for Gst priviously it is 13.9%.
</commit_message>
<xml_diff>
--- a/templates/shakti.docx
+++ b/templates/shakti.docx
@@ -511,8 +511,6 @@
           <w:b/>
         </w:rPr>
       </w:pPr>
-      <w:bookmarkStart w:id="1" w:name="_GoBack"/>
-      <w:bookmarkEnd w:id="1"/>
       <w:r>
         <w:rPr>
           <w:rFonts w:ascii="Charis SIL" w:eastAsia="Times New Roman" w:hAnsi="Charis SIL" w:cs="Charis SIL"/>
@@ -1483,7 +1481,25 @@
                 <w:szCs w:val="24"/>
                 <w:lang w:val="en-IN" w:eastAsia="en-IN"/>
               </w:rPr>
-              <w:t>GST @ 13.8%</w:t>
+              <w:t xml:space="preserve">GST @ </w:t>
+            </w:r>
+            <w:r>
+              <w:rPr>
+                <w:rFonts w:ascii="Times New Roman" w:eastAsia="Times New Roman" w:hAnsi="Times New Roman" w:cs="Times New Roman"/>
+                <w:sz w:val="24"/>
+                <w:szCs w:val="24"/>
+                <w:lang w:val="en-IN" w:eastAsia="en-IN"/>
+              </w:rPr>
+              <w:t>8.9</w:t>
+            </w:r>
+            <w:r>
+              <w:rPr>
+                <w:rFonts w:ascii="Times New Roman" w:eastAsia="Times New Roman" w:hAnsi="Times New Roman" w:cs="Times New Roman"/>
+                <w:sz w:val="24"/>
+                <w:szCs w:val="24"/>
+                <w:lang w:val="en-IN" w:eastAsia="en-IN"/>
+              </w:rPr>
+              <w:t>%</w:t>
             </w:r>
           </w:p>
         </w:tc>
@@ -1739,8 +1755,8 @@
         </w:rPr>
         <w:t xml:space="preserve">} </w:t>
       </w:r>
-      <w:bookmarkStart w:id="2" w:name="_say4wlul6acm"/>
-      <w:bookmarkEnd w:id="2"/>
+      <w:bookmarkStart w:id="1" w:name="_say4wlul6acm"/>
+      <w:bookmarkEnd w:id="1"/>
       <w:r>
         <w:rPr>
           <w:rFonts w:ascii="Charis SIL" w:eastAsia="Times New Roman" w:hAnsi="Charis SIL" w:cs="Charis SIL"/>
@@ -1781,8 +1797,8 @@
           <w:szCs w:val="26"/>
         </w:rPr>
       </w:pPr>
-      <w:bookmarkStart w:id="3" w:name="_t64zxpyk63hu"/>
-      <w:bookmarkEnd w:id="3"/>
+      <w:bookmarkStart w:id="2" w:name="_t64zxpyk63hu"/>
+      <w:bookmarkEnd w:id="2"/>
       <w:r>
         <w:rPr>
           <w:rFonts w:ascii="Charis SIL" w:eastAsia="Times New Roman" w:hAnsi="Charis SIL" w:cs="Charis SIL"/>
@@ -2370,7 +2386,7 @@
           <w:rFonts w:ascii="Charis SIL" w:hAnsi="Charis SIL" w:cs="Charis SIL"/>
         </w:rPr>
       </w:pPr>
-      <w:bookmarkStart w:id="4" w:name="_Hlk206167258"/>
+      <w:bookmarkStart w:id="3" w:name="_Hlk206167258"/>
       <w:r>
         <w:rPr>
           <w:rFonts w:ascii="Charis SIL" w:hAnsi="Charis SIL" w:cs="Charis SIL"/>
@@ -2653,7 +2669,7 @@
         <w:tab/>
       </w:r>
     </w:p>
-    <w:bookmarkEnd w:id="4"/>
+    <w:bookmarkEnd w:id="3"/>
     <w:p>
       <w:pPr>
         <w:rPr>
@@ -2932,8 +2948,8 @@
           <w:rFonts w:ascii="Charis SIL" w:hAnsi="Charis SIL" w:cs="Charis SIL"/>
         </w:rPr>
       </w:pPr>
-      <w:bookmarkStart w:id="5" w:name="TERMS_AND_CONDITIONS:"/>
-      <w:bookmarkEnd w:id="5"/>
+      <w:bookmarkStart w:id="4" w:name="TERMS_AND_CONDITIONS:"/>
+      <w:bookmarkEnd w:id="4"/>
       <w:r>
         <w:rPr>
           <w:rFonts w:ascii="Charis SIL" w:hAnsi="Charis SIL" w:cs="Charis SIL"/>
@@ -3532,7 +3548,15 @@
           <w:spacing w:val="-1"/>
           <w:sz w:val="20"/>
         </w:rPr>
-        <w:t>12%</w:t>
+        <w:t>5</w:t>
+      </w:r>
+      <w:r>
+        <w:rPr>
+          <w:rFonts w:ascii="Charis SIL" w:hAnsi="Charis SIL" w:cs="Charis SIL"/>
+          <w:spacing w:val="-1"/>
+          <w:sz w:val="20"/>
+        </w:rPr>
+        <w:t>%</w:t>
       </w:r>
       <w:r>
         <w:rPr>
@@ -5741,10 +5765,10 @@
         </w:rPr>
         <w:t>warranty.</w:t>
       </w:r>
-      <w:bookmarkStart w:id="6" w:name="Highlights_of_the_Solar_Grid_Power_Plant"/>
-      <w:bookmarkStart w:id="7" w:name="Note:_The_above_mentioned_data_will_be_a"/>
+      <w:bookmarkStart w:id="5" w:name="Highlights_of_the_Solar_Grid_Power_Plant"/>
+      <w:bookmarkStart w:id="6" w:name="Note:_The_above_mentioned_data_will_be_a"/>
+      <w:bookmarkEnd w:id="5"/>
       <w:bookmarkEnd w:id="6"/>
-      <w:bookmarkEnd w:id="7"/>
     </w:p>
     <w:p>
       <w:pPr>
@@ -6015,7 +6039,7 @@
           <w:b/>
         </w:rPr>
       </w:pPr>
-      <w:bookmarkStart w:id="8" w:name="_Hlk206167725"/>
+      <w:bookmarkStart w:id="7" w:name="_Hlk206167725"/>
       <w:r>
         <w:rPr>
           <w:rFonts w:ascii="Charis SIL" w:hAnsi="Charis SIL" w:cs="Charis SIL"/>
@@ -6107,6 +6131,8 @@
           </wp:inline>
         </w:drawing>
       </w:r>
+      <w:bookmarkStart w:id="8" w:name="_GoBack"/>
+      <w:bookmarkEnd w:id="8"/>
     </w:p>
     <w:p>
       <w:pPr>
@@ -6144,7 +6170,7 @@
         <w:t>)</w:t>
       </w:r>
     </w:p>
-    <w:bookmarkEnd w:id="8"/>
+    <w:bookmarkEnd w:id="7"/>
     <w:p>
       <w:pPr>
         <w:pStyle w:val="BodyText"/>
@@ -7016,7 +7042,7 @@
             </wp:anchor>
           </w:drawing>
         </mc:Choice>
-        <mc:Fallback xmlns:oel="http://schemas.microsoft.com/office/2019/extlst" xmlns:w16cex="http://schemas.microsoft.com/office/word/2018/wordml/cex" xmlns:w16="http://schemas.microsoft.com/office/word/2018/wordml" xmlns:w16du="http://schemas.microsoft.com/office/word/2023/wordml/word16du" xmlns:w16sdtdh="http://schemas.microsoft.com/office/word/2020/wordml/sdtdatahash" xmlns:w16sdtfl="http://schemas.microsoft.com/office/word/2024/wordml/sdtformatlock">
+        <mc:Fallback xmlns:w16sdtfl="http://schemas.microsoft.com/office/word/2024/wordml/sdtformatlock" xmlns:w16sdtdh="http://schemas.microsoft.com/office/word/2020/wordml/sdtdatahash" xmlns:w16du="http://schemas.microsoft.com/office/word/2023/wordml/word16du" xmlns:w16="http://schemas.microsoft.com/office/word/2018/wordml" xmlns:w16cex="http://schemas.microsoft.com/office/word/2018/wordml/cex" xmlns:oel="http://schemas.microsoft.com/office/2019/extlst">
           <w:pict>
             <v:rect w14:anchorId="060E2CF2" id="Rectangle 2" o:spid="_x0000_s1026" style="position:absolute;margin-left:0;margin-top:76.45pt;width:534pt;height:7.15pt;z-index:-15971840;visibility:visible;mso-wrap-style:square;mso-width-percent:0;mso-height-percent:0;mso-wrap-distance-left:9pt;mso-wrap-distance-top:0;mso-wrap-distance-right:9pt;mso-wrap-distance-bottom:0;mso-position-horizontal:center;mso-position-horizontal-relative:page;mso-position-vertical:absolute;mso-position-vertical-relative:page;mso-width-percent:0;mso-height-percent:0;mso-width-relative:page;mso-height-relative:page;v-text-anchor:top" o:gfxdata="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" fillcolor="#eb792c" stroked="f">
               <w10:wrap anchorx="page" anchory="page"/>
@@ -8444,7 +8470,7 @@
 </file>
 
 <file path=customXml/itemProps1.xml><?xml version="1.0" encoding="utf-8"?>
-<ds:datastoreItem xmlns:ds="http://schemas.openxmlformats.org/officeDocument/2006/customXml" ds:itemID="{63F25F46-2BF2-47A9-ADA5-DA9B569D16A4}">
+<ds:datastoreItem xmlns:ds="http://schemas.openxmlformats.org/officeDocument/2006/customXml" ds:itemID="{792142D7-8096-4C50-B2AA-EE72E15F7365}">
   <ds:schemaRefs>
     <ds:schemaRef ds:uri="http://schemas.openxmlformats.org/officeDocument/2006/bibliography"/>
   </ds:schemaRefs>

</xml_diff>